<commit_message>
fix(admin): correct Transaction relation names (fromWallet/toWallet)
senderWallet/receiverWallet don't exist in the Prisma schema — correct
names are fromWallet and toWallet per @relation("WalletSent"/"WalletReceived").
This was silently accepted locally (Prisma client not generated) but caused
Railway TypeScript build to fail after `prisma generate`, leaving the old
v0.1.1 container running.

Also updates FamilyPay_Suivi_Sprints_V2.docx with Sprints 6.6–6.8 and
Sprint 11 status.

Co-Authored-By: Claude Sonnet 4.6 <noreply@anthropic.com>
</commit_message>
<xml_diff>
--- a/FamilyPay_Suivi_Sprints_V2.docx
+++ b/FamilyPay_Suivi_Sprints_V2.docx
@@ -1,5 +1,27 @@
 
-<file path=word/document.xml><?xml version="1.0" encoding="utf-8"?>
+<file path=docProps\app.xml><?xml version="1.0" encoding="utf-8"?>
+<Properties xmlns="http://schemas.openxmlformats.org/officeDocument/2006/extended-properties" xmlns:vt="http://schemas.openxmlformats.org/officeDocument/2006/docPropsVTypes"/>
+</file>
+
+<file path=docProps\core.xml><?xml version="1.0" encoding="utf-8"?>
+<cp:coreProperties xmlns:cp="http://schemas.openxmlformats.org/package/2006/metadata/core-properties" xmlns:dc="http://purl.org/dc/elements/1.1/" xmlns:dcterms="http://purl.org/dc/terms/" xmlns:dcmitype="http://purl.org/dc/dcmitype/" xmlns:xsi="http://www.w3.org/2001/XMLSchema-instance">
+  <dc:creator>Un-named</dc:creator>
+  <cp:lastModifiedBy>Un-named</cp:lastModifiedBy>
+  <cp:revision>1</cp:revision>
+  <dcterms:created xsi:type="dcterms:W3CDTF">2026-05-06T10:43:51.084Z</dcterms:created>
+  <dcterms:modified xsi:type="dcterms:W3CDTF">2026-05-06T10:43:51.088Z</dcterms:modified>
+</cp:coreProperties>
+</file>
+
+<file path=docProps\custom.xml><?xml version="1.0" encoding="utf-8"?>
+<Properties xmlns="http://schemas.openxmlformats.org/officeDocument/2006/custom-properties" xmlns:vt="http://schemas.openxmlformats.org/officeDocument/2006/docPropsVTypes"/>
+</file>
+
+<file path=word\comments.xml><?xml version="1.0" encoding="utf-8"?>
+<w:comments xmlns:cx="http://schemas.microsoft.com/office/drawing/2014/chartex" xmlns:cx1="http://schemas.microsoft.com/office/drawing/2015/9/8/chartex" xmlns:cx2="http://schemas.microsoft.com/office/drawing/2015/10/21/chartex" xmlns:cx3="http://schemas.microsoft.com/office/drawing/2016/5/9/chartex" xmlns:cx4="http://schemas.microsoft.com/office/drawing/2016/5/10/chartex" xmlns:cx5="http://schemas.microsoft.com/office/drawing/2016/5/11/chartex" xmlns:cx6="http://schemas.microsoft.com/office/drawing/2016/5/12/chartex" xmlns:cx7="http://schemas.microsoft.com/office/drawing/2016/5/13/chartex" xmlns:cx8="http://schemas.microsoft.com/office/drawing/2016/5/14/chartex" xmlns:mc="http://schemas.openxmlformats.org/markup-compatibility/2006" xmlns:aink="http://schemas.microsoft.com/office/drawing/2016/ink" xmlns:am3d="http://schemas.microsoft.com/office/drawing/2017/model3d" xmlns:o="urn:schemas-microsoft-com:office:office" xmlns:r="http://schemas.openxmlformats.org/officeDocument/2006/relationships" xmlns:m="http://schemas.openxmlformats.org/officeDocument/2006/math" xmlns:v="urn:schemas-microsoft-com:vml" xmlns:wp14="http://schemas.microsoft.com/office/word/2010/wordprocessingDrawing" xmlns:wp="http://schemas.openxmlformats.org/drawingml/2006/wordprocessingDrawing" xmlns:w10="urn:schemas-microsoft-com:office:word" xmlns:w="http://schemas.openxmlformats.org/wordprocessingml/2006/main" xmlns:w14="http://schemas.microsoft.com/office/word/2010/wordml" xmlns:w15="http://schemas.microsoft.com/office/word/2012/wordml" xmlns:w16cex="http://schemas.microsoft.com/office/word/2018/wordml/cex" xmlns:w16cid="http://schemas.microsoft.com/office/word/2016/wordml/cid" xmlns:w16="http://schemas.microsoft.com/office/word/2018/wordml" xmlns:w16sdtdh="http://schemas.microsoft.com/office/word/2020/wordml/sdtdatahash" xmlns:w16se="http://schemas.microsoft.com/office/word/2015/wordml/symex" xmlns:wpg="http://schemas.microsoft.com/office/word/2010/wordprocessingGroup" xmlns:wpi="http://schemas.microsoft.com/office/word/2010/wordprocessingInk" xmlns:wne="http://schemas.microsoft.com/office/word/2006/wordml" xmlns:wps="http://schemas.microsoft.com/office/word/2010/wordprocessingShape"/>
+</file>
+
+<file path=word\document.xml><?xml version="1.0" encoding="utf-8"?>
 <w:document xmlns:wpc="http://schemas.microsoft.com/office/word/2010/wordprocessingCanvas" xmlns:mc="http://schemas.openxmlformats.org/markup-compatibility/2006" xmlns:o="urn:schemas-microsoft-com:office:office" xmlns:r="http://schemas.openxmlformats.org/officeDocument/2006/relationships" xmlns:m="http://schemas.openxmlformats.org/officeDocument/2006/math" xmlns:v="urn:schemas-microsoft-com:vml" xmlns:wp14="http://schemas.microsoft.com/office/word/2010/wordprocessingDrawing" xmlns:wp="http://schemas.openxmlformats.org/drawingml/2006/wordprocessingDrawing" xmlns:w10="urn:schemas-microsoft-com:office:word" xmlns:w="http://schemas.openxmlformats.org/wordprocessingml/2006/main" xmlns:w14="http://schemas.microsoft.com/office/word/2010/wordml" xmlns:w15="http://schemas.microsoft.com/office/word/2012/wordml" xmlns:wpg="http://schemas.microsoft.com/office/word/2010/wordprocessingGroup" xmlns:wpi="http://schemas.microsoft.com/office/word/2010/wordprocessingInk" xmlns:wne="http://schemas.microsoft.com/office/word/2006/wordml" xmlns:wps="http://schemas.microsoft.com/office/word/2010/wordprocessingShape" xmlns:cx="http://schemas.microsoft.com/office/drawing/2014/chartex" xmlns:cx1="http://schemas.microsoft.com/office/drawing/2015/9/8/chartex" xmlns:cx2="http://schemas.microsoft.com/office/drawing/2015/10/21/chartex" xmlns:cx3="http://schemas.microsoft.com/office/drawing/2016/5/9/chartex" xmlns:cx4="http://schemas.microsoft.com/office/drawing/2016/5/10/chartex" xmlns:cx5="http://schemas.microsoft.com/office/drawing/2016/5/11/chartex" xmlns:cx6="http://schemas.microsoft.com/office/drawing/2016/5/12/chartex" xmlns:cx7="http://schemas.microsoft.com/office/drawing/2016/5/13/chartex" xmlns:cx8="http://schemas.microsoft.com/office/drawing/2016/5/14/chartex" xmlns:aink="http://schemas.microsoft.com/office/drawing/2016/ink" xmlns:am3d="http://schemas.microsoft.com/office/drawing/2017/model3d" xmlns:w16cex="http://schemas.microsoft.com/office/word/2018/wordml/cex" xmlns:w16cid="http://schemas.microsoft.com/office/word/2016/wordml/cid" xmlns:w16="http://schemas.microsoft.com/office/word/2018/wordml" xmlns:w16sdtdh="http://schemas.microsoft.com/office/word/2020/wordml/sdtdatahash" xmlns:w16se="http://schemas.microsoft.com/office/word/2015/wordml/symex" mc:Ignorable="w14 w15 wp14">
   <w:body>
     <w:p>
@@ -46,7 +68,7 @@
           <w:sz w:val="22"/>
           <w:szCs w:val="22"/>
         </w:rPr>
-        <w:t xml:space="preserve">Mis à jour le 2026-05-04</w:t>
+        <w:t xml:space="preserve">Mis à jour le 2026-05-07</w:t>
       </w:r>
     </w:p>
     <w:p>
@@ -18435,7 +18457,618 @@
           <w:sz w:val="16"/>
           <w:szCs w:val="16"/>
         </w:rPr>
-        <w:t xml:space="preserve">ALTIVAX FamilyPay V2 — Suivi Sprints — Mis à jour le 2026-05-04 — contact@altivax.com</w:t>
+        <w:t xml:space="preserve">ALTIVAX FamilyPay V2 — Suivi Sprints — Mis à jour le 2026-05-07 — contact@altivax.com</w:t>
+      </w:r>
+    </w:p>
+    <w:p>
+      <w:pPr>
+        <w:spacing w:after="80" w:before="320"/>
+      </w:pPr>
+      <w:r>
+        <w:rPr>
+          <w:rFonts w:ascii="Arial" w:cs="Arial" w:eastAsia="Arial" w:hAnsi="Arial"/>
+          <w:b/>
+          <w:bCs/>
+          <w:color w:val="1F4E79"/>
+          <w:sz w:val="28"/>
+          <w:szCs w:val="28"/>
+        </w:rPr>
+        <w:t xml:space="preserve">S6.6 — Bugs E2E + App Beneficiaire Beta (Web)</w:t>
+      </w:r>
+    </w:p>
+    <w:p>
+      <w:r>
+        <w:rPr>
+          <w:rFonts w:ascii="Arial" w:cs="Arial" w:eastAsia="Arial" w:hAnsi="Arial"/>
+          <w:b/>
+          <w:bCs/>
+          <w:color w:val="107C41"/>
+          <w:sz w:val="20"/>
+          <w:szCs w:val="20"/>
+        </w:rPr>
+        <w:t xml:space="preserve">Statut : Realise   |   Commits : bc72954 + f020ffd   |   SP : 10   |   URL : https://family-pay-beneficiary.vercel.app</w:t>
+      </w:r>
+    </w:p>
+    <w:p>
+      <w:r>
+        <w:rPr>
+          <w:rFonts w:ascii="Arial" w:cs="Arial" w:eastAsia="Arial" w:hAnsi="Arial"/>
+          <w:b w:val="false"/>
+          <w:bCs w:val="false"/>
+          <w:color w:val="333333"/>
+          <w:sz w:val="20"/>
+          <w:szCs w:val="20"/>
+        </w:rPr>
+        <w:t xml:space="preserve">Objectif : Corriger les bugs E2E et livrer l App Beneficiaire en production.</w:t>
+      </w:r>
+    </w:p>
+    <w:p>
+      <w:pPr>
+        <w:spacing w:after="60" w:before="200"/>
+      </w:pPr>
+      <w:r>
+        <w:rPr>
+          <w:rFonts w:ascii="Arial" w:cs="Arial" w:eastAsia="Arial" w:hAnsi="Arial"/>
+          <w:b/>
+          <w:bCs/>
+          <w:color w:val="2E75B6"/>
+          <w:sz w:val="22"/>
+          <w:szCs w:val="22"/>
+        </w:rPr>
+        <w:t xml:space="preserve">4 Bugs E2E corrigés</w:t>
+      </w:r>
+    </w:p>
+    <w:p>
+      <w:r>
+        <w:rPr>
+          <w:rFonts w:ascii="Arial" w:cs="Arial" w:eastAsia="Arial" w:hAnsi="Arial"/>
+          <w:b w:val="false"/>
+          <w:bCs w:val="false"/>
+          <w:color w:val="333333"/>
+          <w:sz w:val="18"/>
+          <w:szCs w:val="18"/>
+        </w:rPr>
+        <w:t xml:space="preserve">- QR_INVALID_OR_EXPIRED : accepte token ?? qrToken</w:t>
+      </w:r>
+    </w:p>
+    <w:p>
+      <w:r>
+        <w:rPr>
+          <w:rFonts w:ascii="Arial" w:cs="Arial" w:eastAsia="Arial" w:hAnsi="Arial"/>
+          <w:b w:val="false"/>
+          <w:bCs w:val="false"/>
+          <w:color w:val="333333"/>
+          <w:sz w:val="18"/>
+          <w:szCs w:val="18"/>
+        </w:rPr>
+        <w:t xml:space="preserve">- Solde enveloppe : debit envelope.balance si envelopeId present</w:t>
+      </w:r>
+    </w:p>
+    <w:p>
+      <w:r>
+        <w:rPr>
+          <w:rFonts w:ascii="Arial" w:cs="Arial" w:eastAsia="Arial" w:hAnsi="Arial"/>
+          <w:b w:val="false"/>
+          <w:bCs w:val="false"/>
+          <w:color w:val="333333"/>
+          <w:sz w:val="18"/>
+          <w:szCs w:val="18"/>
+        </w:rPr>
+        <w:t xml:space="preserve">- Rechargement enveloppe : ajout fundEnvelope() + route POST /api/envelopes/:id/fund</w:t>
+      </w:r>
+    </w:p>
+    <w:p>
+      <w:r>
+        <w:rPr>
+          <w:rFonts w:ascii="Arial" w:cs="Arial" w:eastAsia="Arial" w:hAnsi="Arial"/>
+          <w:b w:val="false"/>
+          <w:bCs w:val="false"/>
+          <w:color w:val="333333"/>
+          <w:sz w:val="18"/>
+          <w:szCs w:val="18"/>
+        </w:rPr>
+        <w:t xml:space="preserve">- TypeScript build : ajout USER_NOT_FOUND / LINK_ALREADY_EXISTS dans errors.ts</w:t>
+      </w:r>
+    </w:p>
+    <w:p>
+      <w:pPr>
+        <w:spacing w:after="60" w:before="200"/>
+      </w:pPr>
+      <w:r>
+        <w:rPr>
+          <w:rFonts w:ascii="Arial" w:cs="Arial" w:eastAsia="Arial" w:hAnsi="Arial"/>
+          <w:b/>
+          <w:bCs/>
+          <w:color w:val="2E75B6"/>
+          <w:sz w:val="22"/>
+          <w:szCs w:val="22"/>
+        </w:rPr>
+        <w:t xml:space="preserve">App Beneficiaire livree</w:t>
+      </w:r>
+    </w:p>
+    <w:p>
+      <w:r>
+        <w:rPr>
+          <w:rFonts w:ascii="Arial" w:cs="Arial" w:eastAsia="Arial" w:hAnsi="Arial"/>
+          <w:b w:val="false"/>
+          <w:bCs w:val="false"/>
+          <w:color w:val="333333"/>
+          <w:sz w:val="18"/>
+          <w:szCs w:val="18"/>
+        </w:rPr>
+        <w:t xml:space="preserve">Login + Dashboard + QR Code 60s + Historique + Fund Request. URL : family-pay-beneficiary.vercel.app</w:t>
+      </w:r>
+    </w:p>
+    <w:p>
+      <w:pPr>
+        <w:spacing w:after="80" w:before="320"/>
+      </w:pPr>
+      <w:r>
+        <w:rPr>
+          <w:rFonts w:ascii="Arial" w:cs="Arial" w:eastAsia="Arial" w:hAnsi="Arial"/>
+          <w:b/>
+          <w:bCs/>
+          <w:color w:val="1F4E79"/>
+          <w:sz w:val="28"/>
+          <w:szCs w:val="28"/>
+        </w:rPr>
+        <w:t xml:space="preserve">S6.7 — App Partenaire Beta + Test E2E QR Complet</w:t>
+      </w:r>
+    </w:p>
+    <w:p>
+      <w:r>
+        <w:rPr>
+          <w:rFonts w:ascii="Arial" w:cs="Arial" w:eastAsia="Arial" w:hAnsi="Arial"/>
+          <w:b/>
+          <w:bCs/>
+          <w:color w:val="107C41"/>
+          <w:sz w:val="20"/>
+          <w:szCs w:val="20"/>
+        </w:rPr>
+        <w:t xml:space="preserve">Statut : Realise   |   Commit : ed4817b   |   SP : 8   |   URL : https://family-pay-partner.vercel.app</w:t>
+      </w:r>
+    </w:p>
+    <w:p>
+      <w:r>
+        <w:rPr>
+          <w:rFonts w:ascii="Arial" w:cs="Arial" w:eastAsia="Arial" w:hAnsi="Arial"/>
+          <w:b w:val="false"/>
+          <w:bCs w:val="false"/>
+          <w:color w:val="333333"/>
+          <w:sz w:val="20"/>
+          <w:szCs w:val="20"/>
+        </w:rPr>
+        <w:t xml:space="preserve">Objectif : Livrer l App Partenaire + valider le flux QR bout-en-bout en production.</w:t>
+      </w:r>
+    </w:p>
+    <w:p>
+      <w:pPr>
+        <w:spacing w:after="60" w:before="200"/>
+      </w:pPr>
+      <w:r>
+        <w:rPr>
+          <w:rFonts w:ascii="Arial" w:cs="Arial" w:eastAsia="Arial" w:hAnsi="Arial"/>
+          <w:b/>
+          <w:bCs/>
+          <w:color w:val="2E75B6"/>
+          <w:sz w:val="22"/>
+          <w:szCs w:val="22"/>
+        </w:rPr>
+        <w:t xml:space="preserve">Test E2E QR valide en production</w:t>
+      </w:r>
+    </w:p>
+    <w:p>
+      <w:r>
+        <w:rPr>
+          <w:rFonts w:ascii="Arial" w:cs="Arial" w:eastAsia="Arial" w:hAnsi="Arial"/>
+          <w:b w:val="false"/>
+          <w:bCs w:val="false"/>
+          <w:color w:val="107C41"/>
+          <w:sz w:val="18"/>
+          <w:szCs w:val="18"/>
+        </w:rPr>
+        <w:t xml:space="preserve">Beneficiaire genere QR -&gt; Partenaire scanne 50 MAD -&gt; Paiement confirme | Replay attack -&gt; QR_ALREADY_USED</w:t>
+      </w:r>
+    </w:p>
+    <w:p>
+      <w:r>
+        <w:rPr>
+          <w:rFonts w:ascii="Arial" w:cs="Arial" w:eastAsia="Arial" w:hAnsi="Arial"/>
+          <w:b w:val="false"/>
+          <w:bCs w:val="false"/>
+          <w:color w:val="107C41"/>
+          <w:sz w:val="18"/>
+          <w:szCs w:val="18"/>
+        </w:rPr>
+        <w:t xml:space="preserve">Solde beneficiaire debite, partenaire credite | Historique visible dans les deux apps</w:t>
+      </w:r>
+    </w:p>
+    <w:p>
+      <w:pPr>
+        <w:spacing w:after="80" w:before="320"/>
+      </w:pPr>
+      <w:r>
+        <w:rPr>
+          <w:rFonts w:ascii="Arial" w:cs="Arial" w:eastAsia="Arial" w:hAnsi="Arial"/>
+          <w:b/>
+          <w:bCs/>
+          <w:color w:val="1F4E79"/>
+          <w:sz w:val="28"/>
+          <w:szCs w:val="28"/>
+        </w:rPr>
+        <w:t xml:space="preserve">S6.8 — App Unifie (Single-App Multi-Role)</w:t>
+      </w:r>
+    </w:p>
+    <w:p>
+      <w:r>
+        <w:rPr>
+          <w:rFonts w:ascii="Arial" w:cs="Arial" w:eastAsia="Arial" w:hAnsi="Arial"/>
+          <w:b/>
+          <w:bCs/>
+          <w:color w:val="107C41"/>
+          <w:sz w:val="20"/>
+          <w:szCs w:val="20"/>
+        </w:rPr>
+        <w:t xml:space="preserve">Statut : Realise   |   Commit : c55042a   |   SP : 8   |   URL : https://family-pay-app-six.vercel.app</w:t>
+      </w:r>
+    </w:p>
+    <w:p>
+      <w:r>
+        <w:rPr>
+          <w:rFonts w:ascii="Arial" w:cs="Arial" w:eastAsia="Arial" w:hAnsi="Arial"/>
+          <w:b w:val="false"/>
+          <w:bCs w:val="false"/>
+          <w:color w:val="333333"/>
+          <w:sz w:val="20"/>
+          <w:szCs w:val="20"/>
+        </w:rPr>
+        <w:t xml:space="preserve">Objectif : Fusionner les 3 apps en une seule URL avec routage base sur le role utilisateur.</w:t>
+      </w:r>
+    </w:p>
+    <w:p>
+      <w:pPr>
+        <w:spacing w:after="60" w:before="200"/>
+      </w:pPr>
+      <w:r>
+        <w:rPr>
+          <w:rFonts w:ascii="Arial" w:cs="Arial" w:eastAsia="Arial" w:hAnsi="Arial"/>
+          <w:b/>
+          <w:bCs/>
+          <w:color w:val="2E75B6"/>
+          <w:sz w:val="22"/>
+          <w:szCs w:val="22"/>
+        </w:rPr>
+        <w:t xml:space="preserve">Architecture</w:t>
+      </w:r>
+    </w:p>
+    <w:p>
+      <w:r>
+        <w:rPr>
+          <w:rFonts w:ascii="Arial" w:cs="Arial" w:eastAsia="Arial" w:hAnsi="Arial"/>
+          <w:b w:val="false"/>
+          <w:bCs w:val="false"/>
+          <w:color w:val="333333"/>
+          <w:sz w:val="18"/>
+          <w:szCs w:val="18"/>
+        </w:rPr>
+        <w:t xml:space="preserve">RoleRedirect : login -&gt; /payer | /beneficiary | /partner | ProtectedRoute par role</w:t>
+      </w:r>
+    </w:p>
+    <w:p>
+      <w:r>
+        <w:rPr>
+          <w:rFonts w:ascii="Arial" w:cs="Arial" w:eastAsia="Arial" w:hAnsi="Arial"/>
+          <w:b w:val="false"/>
+          <w:bCs w:val="false"/>
+          <w:color w:val="333333"/>
+          <w:sz w:val="18"/>
+          <w:szCs w:val="18"/>
+        </w:rPr>
+        <w:t xml:space="preserve">Register 2 etapes : cards visuelles -&gt; formulaire | Store Zustand unifie (familypay-app-auth)</w:t>
+      </w:r>
+    </w:p>
+    <w:p>
+      <w:r>
+        <w:rPr>
+          <w:rFonts w:ascii="Arial" w:cs="Arial" w:eastAsia="Arial" w:hAnsi="Arial"/>
+          <w:b w:val="false"/>
+          <w:bCs w:val="false"/>
+          <w:color w:val="333333"/>
+          <w:sz w:val="18"/>
+          <w:szCs w:val="18"/>
+        </w:rPr>
+        <w:t xml:space="preserve">vercel.json rewrites SPA | CORS Railway mis a jour</w:t>
+      </w:r>
+    </w:p>
+    <w:p>
+      <w:pPr>
+        <w:spacing w:after="80" w:before="320"/>
+      </w:pPr>
+      <w:r>
+        <w:rPr>
+          <w:rFonts w:ascii="Arial" w:cs="Arial" w:eastAsia="Arial" w:hAnsi="Arial"/>
+          <w:b/>
+          <w:bCs/>
+          <w:color w:val="1F4E79"/>
+          <w:sz w:val="28"/>
+          <w:szCs w:val="28"/>
+        </w:rPr>
+        <w:t xml:space="preserve">Sprint 11 — Super Admin Dashboard ALTIVAX</w:t>
+      </w:r>
+    </w:p>
+    <w:p>
+      <w:r>
+        <w:rPr>
+          <w:rFonts w:ascii="Arial" w:cs="Arial" w:eastAsia="Arial" w:hAnsi="Arial"/>
+          <w:b/>
+          <w:bCs/>
+          <w:color w:val="C55A11"/>
+          <w:sz w:val="20"/>
+          <w:szCs w:val="20"/>
+        </w:rPr>
+        <w:t xml:space="preserve">Statut : EN COURS   |   Commits : d94cad9 + 67c9803 + a2852aa   |   SP : 12</w:t>
+      </w:r>
+    </w:p>
+    <w:p>
+      <w:r>
+        <w:rPr>
+          <w:rFonts w:ascii="Arial" w:cs="Arial" w:eastAsia="Arial" w:hAnsi="Arial"/>
+          <w:b w:val="false"/>
+          <w:bCs w:val="false"/>
+          <w:color w:val="333333"/>
+          <w:sz w:val="20"/>
+          <w:szCs w:val="20"/>
+        </w:rPr>
+        <w:t xml:space="preserve">Objectif : Vue globale ALTIVAX — stats, validation partenaires, gestion utilisateurs, transactions cross-tenant.</w:t>
+      </w:r>
+    </w:p>
+    <w:p>
+      <w:pPr>
+        <w:spacing w:after="60" w:before="200"/>
+      </w:pPr>
+      <w:r>
+        <w:rPr>
+          <w:rFonts w:ascii="Arial" w:cs="Arial" w:eastAsia="Arial" w:hAnsi="Arial"/>
+          <w:b/>
+          <w:bCs/>
+          <w:color w:val="2E75B6"/>
+          <w:sz w:val="22"/>
+          <w:szCs w:val="22"/>
+        </w:rPr>
+        <w:t xml:space="preserve">Backend — 7 routes /api/admin/* (codees + pushees sur main)</w:t>
+      </w:r>
+    </w:p>
+    <w:p>
+      <w:r>
+        <w:rPr>
+          <w:rFonts w:ascii="Arial" w:cs="Arial" w:eastAsia="Arial" w:hAnsi="Arial"/>
+          <w:b w:val="false"/>
+          <w:bCs w:val="false"/>
+          <w:color w:val="333333"/>
+          <w:sz w:val="18"/>
+          <w:szCs w:val="18"/>
+        </w:rPr>
+        <w:t xml:space="preserve">GET /api/admin/stats | GET /api/admin/users | GET /api/admin/partners</w:t>
+      </w:r>
+    </w:p>
+    <w:p>
+      <w:r>
+        <w:rPr>
+          <w:rFonts w:ascii="Arial" w:cs="Arial" w:eastAsia="Arial" w:hAnsi="Arial"/>
+          <w:b w:val="false"/>
+          <w:bCs w:val="false"/>
+          <w:color w:val="333333"/>
+          <w:sz w:val="18"/>
+          <w:szCs w:val="18"/>
+        </w:rPr>
+        <w:t xml:space="preserve">PATCH /api/admin/partners/:id/approve | PATCH /api/admin/partners/:id/reject</w:t>
+      </w:r>
+    </w:p>
+    <w:p>
+      <w:r>
+        <w:rPr>
+          <w:rFonts w:ascii="Arial" w:cs="Arial" w:eastAsia="Arial" w:hAnsi="Arial"/>
+          <w:b w:val="false"/>
+          <w:bCs w:val="false"/>
+          <w:color w:val="333333"/>
+          <w:sz w:val="18"/>
+          <w:szCs w:val="18"/>
+        </w:rPr>
+        <w:t xml:space="preserve">GET /api/admin/transactions (cross-tenant) | PATCH /api/admin/users/:id/toggle</w:t>
+      </w:r>
+    </w:p>
+    <w:p>
+      <w:pPr>
+        <w:spacing w:after="60" w:before="200"/>
+      </w:pPr>
+      <w:r>
+        <w:rPr>
+          <w:rFonts w:ascii="Arial" w:cs="Arial" w:eastAsia="Arial" w:hAnsi="Arial"/>
+          <w:b/>
+          <w:bCs/>
+          <w:color w:val="2E75B6"/>
+          <w:sz w:val="22"/>
+          <w:szCs w:val="22"/>
+        </w:rPr>
+        <w:t xml:space="preserve">Frontend — 4 pages admin</w:t>
+      </w:r>
+    </w:p>
+    <w:p>
+      <w:r>
+        <w:rPr>
+          <w:rFonts w:ascii="Arial" w:cs="Arial" w:eastAsia="Arial" w:hAnsi="Arial"/>
+          <w:b w:val="false"/>
+          <w:bCs w:val="false"/>
+          <w:color w:val="333333"/>
+          <w:sz w:val="18"/>
+          <w:szCs w:val="18"/>
+        </w:rPr>
+        <w:t xml:space="preserve">AdminLayout (sidebar dark) | AdminDashboard | AdminPartnersPage | AdminUsersPage | AdminTransactionsPage</w:t>
+      </w:r>
+    </w:p>
+    <w:p>
+      <w:pPr>
+        <w:spacing w:after="60" w:before="200"/>
+      </w:pPr>
+      <w:r>
+        <w:rPr>
+          <w:rFonts w:ascii="Arial" w:cs="Arial" w:eastAsia="Arial" w:hAnsi="Arial"/>
+          <w:b/>
+          <w:bCs/>
+          <w:color w:val="2E75B6"/>
+          <w:sz w:val="22"/>
+          <w:szCs w:val="22"/>
+        </w:rPr>
+        <w:t xml:space="preserve">Bugs corriges dans ce sprint</w:t>
+      </w:r>
+    </w:p>
+    <w:p>
+      <w:r>
+        <w:rPr>
+          <w:rFonts w:ascii="Arial" w:cs="Arial" w:eastAsia="Arial" w:hAnsi="Arial"/>
+          <w:b w:val="false"/>
+          <w:bCs w:val="false"/>
+          <w:color w:val="333333"/>
+          <w:sz w:val="18"/>
+          <w:szCs w:val="18"/>
+        </w:rPr>
+        <w:t xml:space="preserve">PARTNER 500 Unique phone -&gt; data.phone || undefined -&gt; NULL</w:t>
+      </w:r>
+    </w:p>
+    <w:p>
+      <w:r>
+        <w:rPr>
+          <w:rFonts w:ascii="Arial" w:cs="Arial" w:eastAsia="Arial" w:hAnsi="Arial"/>
+          <w:b w:val="false"/>
+          <w:bCs w:val="false"/>
+          <w:color w:val="333333"/>
+          <w:sz w:val="18"/>
+          <w:szCs w:val="18"/>
+        </w:rPr>
+        <w:t xml:space="preserve">PARTNER 500 race condition -&gt; prismaAdmin.transaction() atomique</w:t>
+      </w:r>
+    </w:p>
+    <w:p>
+      <w:r>
+        <w:rPr>
+          <w:rFonts w:ascii="Arial" w:cs="Arial" w:eastAsia="Arial" w:hAnsi="Arial"/>
+          <w:b w:val="false"/>
+          <w:bCs w:val="false"/>
+          <w:color w:val="333333"/>
+          <w:sz w:val="18"/>
+          <w:szCs w:val="18"/>
+        </w:rPr>
+        <w:t xml:space="preserve">Railway build silencieux -&gt; Dockerfile supprime + nixpacks.toml</w:t>
+      </w:r>
+    </w:p>
+    <w:p>
+      <w:r>
+        <w:rPr>
+          <w:rFonts w:ascii="Arial" w:cs="Arial" w:eastAsia="Arial" w:hAnsi="Arial"/>
+          <w:b w:val="false"/>
+          <w:bCs w:val="false"/>
+          <w:color w:val="333333"/>
+          <w:sz w:val="18"/>
+          <w:szCs w:val="18"/>
+        </w:rPr>
+        <w:t xml:space="preserve">TypeScript EnvelopeCategory -&gt; type local dans envelope.service.ts</w:t>
+      </w:r>
+    </w:p>
+    <w:p>
+      <w:pPr>
+        <w:spacing w:after="60" w:before="200"/>
+      </w:pPr>
+      <w:r>
+        <w:rPr>
+          <w:rFonts w:ascii="Arial" w:cs="Arial" w:eastAsia="Arial" w:hAnsi="Arial"/>
+          <w:b/>
+          <w:bCs/>
+          <w:color w:val="2E75B6"/>
+          <w:sz w:val="22"/>
+          <w:szCs w:val="22"/>
+        </w:rPr>
+        <w:t xml:space="preserve">Blocage Railway — Root Directory (resolu)</w:t>
+      </w:r>
+    </w:p>
+    <w:p>
+      <w:r>
+        <w:rPr>
+          <w:rFonts w:ascii="Arial" w:cs="Arial" w:eastAsia="Arial" w:hAnsi="Arial"/>
+          <w:b w:val="false"/>
+          <w:bCs w:val="false"/>
+          <w:color w:val="C55A11"/>
+          <w:sz w:val="18"/>
+          <w:szCs w:val="18"/>
+        </w:rPr>
+        <w:t xml:space="preserve">Cause : buildait depuis racine monorepo -&gt; image Docker v0.1.1 en cache</w:t>
+      </w:r>
+    </w:p>
+    <w:p>
+      <w:r>
+        <w:rPr>
+          <w:rFonts w:ascii="Arial" w:cs="Arial" w:eastAsia="Arial" w:hAnsi="Arial"/>
+          <w:b w:val="false"/>
+          <w:bCs w:val="false"/>
+          <w:color w:val="333333"/>
+          <w:sz w:val="18"/>
+          <w:szCs w:val="18"/>
+        </w:rPr>
+        <w:t xml:space="preserve">Fix : Railway Root Directory = apps/backend | Start Command = node dist/index.js</w:t>
+      </w:r>
+    </w:p>
+    <w:p>
+      <w:r>
+        <w:rPr>
+          <w:rFonts w:ascii="Arial" w:cs="Arial" w:eastAsia="Arial" w:hAnsi="Arial"/>
+          <w:b w:val="false"/>
+          <w:bCs w:val="false"/>
+          <w:color w:val="333333"/>
+          <w:sz w:val="18"/>
+          <w:szCs w:val="18"/>
+        </w:rPr>
+        <w:t xml:space="preserve">Fix : package.json 0.1.1 -&gt; 0.2.0 | nixpacks.toml | prestart || true</w:t>
+      </w:r>
+    </w:p>
+    <w:p>
+      <w:pPr>
+        <w:spacing w:after="60" w:before="200"/>
+      </w:pPr>
+      <w:r>
+        <w:rPr>
+          <w:rFonts w:ascii="Arial" w:cs="Arial" w:eastAsia="Arial" w:hAnsi="Arial"/>
+          <w:b/>
+          <w:bCs/>
+          <w:color w:val="2E75B6"/>
+          <w:sz w:val="22"/>
+          <w:szCs w:val="22"/>
+        </w:rPr>
+        <w:t xml:space="preserve">Definition of Done — En attente</w:t>
+      </w:r>
+    </w:p>
+    <w:p>
+      <w:r>
+        <w:rPr>
+          <w:rFonts w:ascii="Arial" w:cs="Arial" w:eastAsia="Arial" w:hAnsi="Arial"/>
+          <w:b w:val="false"/>
+          <w:bCs w:val="false"/>
+          <w:color w:val="C55A11"/>
+          <w:sz w:val="18"/>
+          <w:szCs w:val="18"/>
+        </w:rPr>
+        <w:t xml:space="preserve">[] GET /health -&gt; version:0.2.0  [] GET /api/admin/stats -&gt; 401  [] Login admin@altivax.com -&gt; /admin visible</w:t>
+      </w:r>
+    </w:p>
+    <w:p>
+      <w:r>
+        <w:rPr>
+          <w:rFonts w:ascii="Arial" w:cs="Arial" w:eastAsia="Arial" w:hAnsi="Arial"/>
+          <w:b w:val="false"/>
+          <w:bCs w:val="false"/>
+          <w:color w:val="555555"/>
+          <w:sz w:val="18"/>
+          <w:szCs w:val="18"/>
+        </w:rPr>
+        <w:t xml:space="preserve">Variables Railway : ADMIN_EMAIL=admin@altivax.com | ADMIN_PASSWORD=Altivax2026! | ADMIN_SETUP_TOKEN=...</w:t>
       </w:r>
     </w:p>
     <w:sectPr>
@@ -18450,11 +19083,7 @@
 </w:document>
 </file>
 
-<file path=word/comments.xml><?xml version="1.0" encoding="utf-8"?>
-<w:comments xmlns:cx="http://schemas.microsoft.com/office/drawing/2014/chartex" xmlns:cx1="http://schemas.microsoft.com/office/drawing/2015/9/8/chartex" xmlns:cx2="http://schemas.microsoft.com/office/drawing/2015/10/21/chartex" xmlns:cx3="http://schemas.microsoft.com/office/drawing/2016/5/9/chartex" xmlns:cx4="http://schemas.microsoft.com/office/drawing/2016/5/10/chartex" xmlns:cx5="http://schemas.microsoft.com/office/drawing/2016/5/11/chartex" xmlns:cx6="http://schemas.microsoft.com/office/drawing/2016/5/12/chartex" xmlns:cx7="http://schemas.microsoft.com/office/drawing/2016/5/13/chartex" xmlns:cx8="http://schemas.microsoft.com/office/drawing/2016/5/14/chartex" xmlns:mc="http://schemas.openxmlformats.org/markup-compatibility/2006" xmlns:aink="http://schemas.microsoft.com/office/drawing/2016/ink" xmlns:am3d="http://schemas.microsoft.com/office/drawing/2017/model3d" xmlns:o="urn:schemas-microsoft-com:office:office" xmlns:r="http://schemas.openxmlformats.org/officeDocument/2006/relationships" xmlns:m="http://schemas.openxmlformats.org/officeDocument/2006/math" xmlns:v="urn:schemas-microsoft-com:vml" xmlns:wp14="http://schemas.microsoft.com/office/word/2010/wordprocessingDrawing" xmlns:wp="http://schemas.openxmlformats.org/drawingml/2006/wordprocessingDrawing" xmlns:w10="urn:schemas-microsoft-com:office:word" xmlns:w="http://schemas.openxmlformats.org/wordprocessingml/2006/main" xmlns:w14="http://schemas.microsoft.com/office/word/2010/wordml" xmlns:w15="http://schemas.microsoft.com/office/word/2012/wordml" xmlns:w16cex="http://schemas.microsoft.com/office/word/2018/wordml/cex" xmlns:w16cid="http://schemas.microsoft.com/office/word/2016/wordml/cid" xmlns:w16="http://schemas.microsoft.com/office/word/2018/wordml" xmlns:w16sdtdh="http://schemas.microsoft.com/office/word/2020/wordml/sdtdatahash" xmlns:w16se="http://schemas.microsoft.com/office/word/2015/wordml/symex" xmlns:wpg="http://schemas.microsoft.com/office/word/2010/wordprocessingGroup" xmlns:wpi="http://schemas.microsoft.com/office/word/2010/wordprocessingInk" xmlns:wne="http://schemas.microsoft.com/office/word/2006/wordml" xmlns:wps="http://schemas.microsoft.com/office/word/2010/wordprocessingShape"/>
-</file>
-
-<file path=word/endnotes.xml><?xml version="1.0" encoding="utf-8"?>
+<file path=word\endnotes.xml><?xml version="1.0" encoding="utf-8"?>
 <w:endnotes xmlns:wpc="http://schemas.microsoft.com/office/word/2010/wordprocessingCanvas" xmlns:mc="http://schemas.openxmlformats.org/markup-compatibility/2006" xmlns:o="urn:schemas-microsoft-com:office:office" xmlns:r="http://schemas.openxmlformats.org/officeDocument/2006/relationships" xmlns:m="http://schemas.openxmlformats.org/officeDocument/2006/math" xmlns:v="urn:schemas-microsoft-com:vml" xmlns:wp14="http://schemas.microsoft.com/office/word/2010/wordprocessingDrawing" xmlns:wp="http://schemas.openxmlformats.org/drawingml/2006/wordprocessingDrawing" xmlns:w10="urn:schemas-microsoft-com:office:word" xmlns:w="http://schemas.openxmlformats.org/wordprocessingml/2006/main" xmlns:w14="http://schemas.microsoft.com/office/word/2010/wordml" xmlns:w15="http://schemas.microsoft.com/office/word/2012/wordml" xmlns:wpg="http://schemas.microsoft.com/office/word/2010/wordprocessingGroup" xmlns:wpi="http://schemas.microsoft.com/office/word/2010/wordprocessingInk" xmlns:wne="http://schemas.microsoft.com/office/word/2006/wordml" xmlns:wps="http://schemas.microsoft.com/office/word/2010/wordprocessingShape" mc:Ignorable="w14 w15 wp14">
   <w:endnote w:type="separator" w:id="-1">
     <w:p>
@@ -18491,7 +19120,11 @@
 </w:endnotes>
 </file>
 
-<file path=word/footer1.xml><?xml version="1.0" encoding="utf-8"?>
+<file path=word\fontTable.xml><?xml version="1.0" encoding="utf-8"?>
+<w:fonts xmlns:mc="http://schemas.openxmlformats.org/markup-compatibility/2006" xmlns:r="http://schemas.openxmlformats.org/officeDocument/2006/relationships" xmlns:w="http://schemas.openxmlformats.org/wordprocessingml/2006/main" xmlns:w14="http://schemas.microsoft.com/office/word/2010/wordml" xmlns:w15="http://schemas.microsoft.com/office/word/2012/wordml" xmlns:w16cex="http://schemas.microsoft.com/office/word/2018/wordml/cex" xmlns:w16cid="http://schemas.microsoft.com/office/word/2016/wordml/cid" xmlns:w16="http://schemas.microsoft.com/office/word/2018/wordml" xmlns:w16sdtdh="http://schemas.microsoft.com/office/word/2020/wordml/sdtdatahash" xmlns:w16se="http://schemas.microsoft.com/office/word/2015/wordml/symex" mc:Ignorable="w14 w15 w16se w16cid w16 w16cex w16sdtdh"/>
+</file>
+
+<file path=word\footer1.xml><?xml version="1.0" encoding="utf-8"?>
 <w:ftr xmlns:wpc="http://schemas.microsoft.com/office/word/2010/wordprocessingCanvas" xmlns:mc="http://schemas.openxmlformats.org/markup-compatibility/2006" xmlns:o="urn:schemas-microsoft-com:office:office" xmlns:r="http://schemas.openxmlformats.org/officeDocument/2006/relationships" xmlns:m="http://schemas.openxmlformats.org/officeDocument/2006/math" xmlns:v="urn:schemas-microsoft-com:vml" xmlns:wp14="http://schemas.microsoft.com/office/word/2010/wordprocessingDrawing" xmlns:wp="http://schemas.openxmlformats.org/drawingml/2006/wordprocessingDrawing" xmlns:w10="urn:schemas-microsoft-com:office:word" xmlns:w="http://schemas.openxmlformats.org/wordprocessingml/2006/main" xmlns:w14="http://schemas.microsoft.com/office/word/2010/wordml" xmlns:w15="http://schemas.microsoft.com/office/word/2012/wordml" xmlns:wpg="http://schemas.microsoft.com/office/word/2010/wordprocessingGroup" xmlns:wpi="http://schemas.microsoft.com/office/word/2010/wordprocessingInk" xmlns:wne="http://schemas.microsoft.com/office/word/2006/wordml" xmlns:wps="http://schemas.microsoft.com/office/word/2010/wordprocessingShape">
   <w:p>
     <w:pPr>
@@ -18546,7 +19179,7 @@
 </w:ftr>
 </file>
 
-<file path=word/footnotes.xml><?xml version="1.0" encoding="utf-8"?>
+<file path=word\footnotes.xml><?xml version="1.0" encoding="utf-8"?>
 <w:footnotes xmlns:wpc="http://schemas.microsoft.com/office/word/2010/wordprocessingCanvas" xmlns:mc="http://schemas.openxmlformats.org/markup-compatibility/2006" xmlns:o="urn:schemas-microsoft-com:office:office" xmlns:r="http://schemas.openxmlformats.org/officeDocument/2006/relationships" xmlns:m="http://schemas.openxmlformats.org/officeDocument/2006/math" xmlns:v="urn:schemas-microsoft-com:vml" xmlns:wp14="http://schemas.microsoft.com/office/word/2010/wordprocessingDrawing" xmlns:wp="http://schemas.openxmlformats.org/drawingml/2006/wordprocessingDrawing" xmlns:w10="urn:schemas-microsoft-com:office:word" xmlns:w="http://schemas.openxmlformats.org/wordprocessingml/2006/main" xmlns:w14="http://schemas.microsoft.com/office/word/2010/wordml" xmlns:w15="http://schemas.microsoft.com/office/word/2012/wordml" xmlns:wpg="http://schemas.microsoft.com/office/word/2010/wordprocessingGroup" xmlns:wpi="http://schemas.microsoft.com/office/word/2010/wordprocessingInk" xmlns:wne="http://schemas.microsoft.com/office/word/2006/wordml" xmlns:wps="http://schemas.microsoft.com/office/word/2010/wordprocessingShape" mc:Ignorable="w14 w15 wp14">
   <w:footnote w:type="separator" w:id="-1">
     <w:p>
@@ -18583,7 +19216,7 @@
 </w:footnotes>
 </file>
 
-<file path=word/header1.xml><?xml version="1.0" encoding="utf-8"?>
+<file path=word\header1.xml><?xml version="1.0" encoding="utf-8"?>
 <w:hdr xmlns:wpc="http://schemas.microsoft.com/office/word/2010/wordprocessingCanvas" xmlns:mc="http://schemas.openxmlformats.org/markup-compatibility/2006" xmlns:o="urn:schemas-microsoft-com:office:office" xmlns:r="http://schemas.openxmlformats.org/officeDocument/2006/relationships" xmlns:m="http://schemas.openxmlformats.org/officeDocument/2006/math" xmlns:v="urn:schemas-microsoft-com:vml" xmlns:wp14="http://schemas.microsoft.com/office/word/2010/wordprocessingDrawing" xmlns:wp="http://schemas.openxmlformats.org/drawingml/2006/wordprocessingDrawing" xmlns:w10="urn:schemas-microsoft-com:office:word" xmlns:w="http://schemas.openxmlformats.org/wordprocessingml/2006/main" xmlns:w14="http://schemas.microsoft.com/office/word/2010/wordml" xmlns:w15="http://schemas.microsoft.com/office/word/2012/wordml" xmlns:wpg="http://schemas.microsoft.com/office/word/2010/wordprocessingGroup" xmlns:wpi="http://schemas.microsoft.com/office/word/2010/wordprocessingInk" xmlns:wne="http://schemas.microsoft.com/office/word/2006/wordml" xmlns:wps="http://schemas.microsoft.com/office/word/2010/wordprocessingShape" xmlns:cx="http://schemas.microsoft.com/office/drawing/2014/chartex" xmlns:cx1="http://schemas.microsoft.com/office/drawing/2015/9/8/chartex" xmlns:cx2="http://schemas.microsoft.com/office/drawing/2015/10/21/chartex" xmlns:cx3="http://schemas.microsoft.com/office/drawing/2016/5/9/chartex" xmlns:cx4="http://schemas.microsoft.com/office/drawing/2016/5/10/chartex" xmlns:cx5="http://schemas.microsoft.com/office/drawing/2016/5/11/chartex" xmlns:cx6="http://schemas.microsoft.com/office/drawing/2016/5/12/chartex" xmlns:cx7="http://schemas.microsoft.com/office/drawing/2016/5/13/chartex" xmlns:cx8="http://schemas.microsoft.com/office/drawing/2016/5/14/chartex" xmlns:w16cid="http://schemas.microsoft.com/office/word/2016/wordml/cid" xmlns:w16se="http://schemas.microsoft.com/office/word/2015/wordml/symex">
   <w:p>
     <w:pPr>
@@ -18605,7 +19238,7 @@
 </w:hdr>
 </file>
 
-<file path=word/numbering.xml><?xml version="1.0" encoding="utf-8"?>
+<file path=word\numbering.xml><?xml version="1.0" encoding="utf-8"?>
 <w:numbering xmlns:wpc="http://schemas.microsoft.com/office/word/2010/wordprocessingCanvas" xmlns:mc="http://schemas.openxmlformats.org/markup-compatibility/2006" xmlns:o="urn:schemas-microsoft-com:office:office" xmlns:r="http://schemas.openxmlformats.org/officeDocument/2006/relationships" xmlns:m="http://schemas.openxmlformats.org/officeDocument/2006/math" xmlns:v="urn:schemas-microsoft-com:vml" xmlns:wp14="http://schemas.microsoft.com/office/word/2010/wordprocessingDrawing" xmlns:wp="http://schemas.openxmlformats.org/drawingml/2006/wordprocessingDrawing" xmlns:w10="urn:schemas-microsoft-com:office:word" xmlns:w="http://schemas.openxmlformats.org/wordprocessingml/2006/main" xmlns:w14="http://schemas.microsoft.com/office/word/2010/wordml" xmlns:w15="http://schemas.microsoft.com/office/word/2012/wordml" xmlns:wpg="http://schemas.microsoft.com/office/word/2010/wordprocessingGroup" xmlns:wpi="http://schemas.microsoft.com/office/word/2010/wordprocessingInk" xmlns:wne="http://schemas.microsoft.com/office/word/2006/wordml" xmlns:wps="http://schemas.microsoft.com/office/word/2010/wordprocessingShape" mc:Ignorable="w14 w15 wp14">
   <w:abstractNum w:abstractNumId="1" w15:restartNumberingAfterBreak="0">
     <w:multiLevelType w:val="hybridMultilevel"/>
@@ -18718,7 +19351,17 @@
 </w:numbering>
 </file>
 
-<file path=word/styles.xml><?xml version="1.0" encoding="utf-8"?>
+<file path=word\settings.xml><?xml version="1.0" encoding="utf-8"?>
+<w:settings xmlns:wpc="http://schemas.microsoft.com/office/word/2010/wordprocessingCanvas" xmlns:mc="http://schemas.openxmlformats.org/markup-compatibility/2006" xmlns:o="urn:schemas-microsoft-com:office:office" xmlns:r="http://schemas.openxmlformats.org/officeDocument/2006/relationships" xmlns:m="http://schemas.openxmlformats.org/officeDocument/2006/math" xmlns:v="urn:schemas-microsoft-com:vml" xmlns:wp14="http://schemas.microsoft.com/office/word/2010/wordprocessingDrawing" xmlns:wp="http://schemas.openxmlformats.org/drawingml/2006/wordprocessingDrawing" xmlns:w10="urn:schemas-microsoft-com:office:word" xmlns:w="http://schemas.openxmlformats.org/wordprocessingml/2006/main" xmlns:w14="http://schemas.microsoft.com/office/word/2010/wordml" xmlns:w15="http://schemas.microsoft.com/office/word/2012/wordml" xmlns:wpg="http://schemas.microsoft.com/office/word/2010/wordprocessingGroup" xmlns:wpi="http://schemas.microsoft.com/office/word/2010/wordprocessingInk" xmlns:wne="http://schemas.microsoft.com/office/word/2006/wordml" xmlns:wps="http://schemas.microsoft.com/office/word/2010/wordprocessingShape" mc:Ignorable="w14 w15 wp14">
+  <w:displayBackgroundShape/>
+  <w:evenAndOddHeaders w:val="false"/>
+  <w:compat>
+    <w:compatSetting w:val="15" w:name="compatibilityMode" w:uri="http://schemas.microsoft.com/office/word"/>
+  </w:compat>
+</w:settings>
+</file>
+
+<file path=word\styles.xml><?xml version="1.0" encoding="utf-8"?>
 <w:styles xmlns:mc="http://schemas.openxmlformats.org/markup-compatibility/2006" xmlns:r="http://schemas.openxmlformats.org/officeDocument/2006/relationships" xmlns:w="http://schemas.openxmlformats.org/wordprocessingml/2006/main" xmlns:w14="http://schemas.microsoft.com/office/word/2010/wordml" xmlns:w15="http://schemas.microsoft.com/office/word/2012/wordml" mc:Ignorable="w14 w15">
   <w:docDefaults>
     <w:rPrDefault>

</xml_diff>